<commit_message>
Rebuild the characteristics figure with a balanced layout
</commit_message>
<xml_diff>
--- a/manuscript/SDC 6.docx
+++ b/manuscript/SDC 6.docx
@@ -10272,7 +10272,7 @@
       <w:r>
         <w:drawing>
           <wp:inline xmlns:a="http://schemas.openxmlformats.org/drawingml/2006/main" xmlns:pic="http://schemas.openxmlformats.org/drawingml/2006/picture">
-            <wp:extent cx="5669280" cy="4354282"/>
+            <wp:extent cx="5669280" cy="3881457"/>
             <wp:docPr id="1" name="Picture 1"/>
             <wp:cNvGraphicFramePr>
               <a:graphicFrameLocks noChangeAspect="1"/>
@@ -10293,7 +10293,7 @@
                   <pic:spPr>
                     <a:xfrm>
                       <a:off x="0" y="0"/>
-                      <a:ext cx="5669280" cy="4354282"/>
+                      <a:ext cx="5669280" cy="3881457"/>
                     </a:xfrm>
                     <a:prstGeom prst="rect"/>
                   </pic:spPr>
@@ -10324,7 +10324,7 @@
           <w:i w:val="0"/>
           <w:sz w:val="22"/>
         </w:rPr>
-        <w:t>Characteristics of the 70 core studies. (A) Publication period. (B) Study design. (C) Tumor category of the study sample. (D) Evidence stream.</w:t>
+        <w:t>Characteristics of the 70 core studies. (A) Study design. (B) Tumor category of the study sample. (C) Publication period. (D) Evidence stream.</w:t>
       </w:r>
     </w:p>
     <w:p>

</xml_diff>